<commit_message>
docs: modo twilio en el manual de instalación (decisión 22)
</commit_message>
<xml_diff>
--- a/docs/para-drive/Decisiones técnicas.docx
+++ b/docs/para-drive/Decisiones técnicas.docx
@@ -2,7 +2,7 @@
 <file path=word/document.xml><?xml version="1.0" encoding="utf-8"?>
 <w:document xmlns:w="http://schemas.openxmlformats.org/wordprocessingml/2006/main" xmlns:m="http://schemas.openxmlformats.org/officeDocument/2006/math" xmlns:r="http://schemas.openxmlformats.org/officeDocument/2006/relationships" xmlns:o="urn:schemas-microsoft-com:office:office" xmlns:v="urn:schemas-microsoft-com:vml" xmlns:w10="urn:schemas-microsoft-com:office:word" xmlns:a="http://schemas.openxmlformats.org/drawingml/2006/main" xmlns:pic="http://schemas.openxmlformats.org/drawingml/2006/picture" xmlns:wp="http://schemas.openxmlformats.org/drawingml/2006/wordprocessingDrawing">
   <w:body>
-    <w:bookmarkStart w:id="42" w:name="decisiones-técnicas"/>
+    <w:bookmarkStart w:id="43" w:name="decisiones-técnicas"/>
     <w:p>
       <w:pPr>
         <w:pStyle w:val="Heading1"/>
@@ -2406,7 +2406,146 @@
       </w:r>
     </w:p>
     <w:bookmarkEnd w:id="41"/>
+    <w:bookmarkStart w:id="42" w:name="X7772f9f1d15ad4f59c48f3222e45fb060edf70f"/>
+    <w:p>
+      <w:pPr>
+        <w:pStyle w:val="Heading2"/>
+      </w:pPr>
+      <w:r>
+        <w:t xml:space="preserve">22. Twilio como proveedor de pruebas de WhatsApp (8 de octubre)</w:t>
+      </w:r>
+    </w:p>
+    <w:p>
+      <w:pPr>
+        <w:pStyle w:val="FirstParagraph"/>
+      </w:pPr>
+      <w:r>
+        <w:t xml:space="preserve">La API de WhatsApp Cloud exige una app en Meta for Developers, y crear la</w:t>
+      </w:r>
+      <w:r>
+        <w:t xml:space="preserve"> </w:t>
+      </w:r>
+      <w:r>
+        <w:t xml:space="preserve">cuenta no fue posible a tiempo. Para probar el envío automático sin esa</w:t>
+      </w:r>
+      <w:r>
+        <w:t xml:space="preserve"> </w:t>
+      </w:r>
+      <w:r>
+        <w:t xml:space="preserve">cuenta se agregó el modo</w:t>
+      </w:r>
+      <w:r>
+        <w:t xml:space="preserve"> </w:t>
+      </w:r>
+      <w:r>
+        <w:rPr>
+          <w:rStyle w:val="VerbatimChar"/>
+        </w:rPr>
+        <w:t xml:space="preserve">twilio</w:t>
+      </w:r>
+      <w:r>
+        <w:t xml:space="preserve">, que usa el WhatsApp Sandbox de Twilio:</w:t>
+      </w:r>
+      <w:r>
+        <w:t xml:space="preserve"> </w:t>
+      </w:r>
+      <w:r>
+        <w:t xml:space="preserve">se registra con correo y celular, tiene crédito de prueba y envía el texto</w:t>
+      </w:r>
+      <w:r>
+        <w:t xml:space="preserve"> </w:t>
+      </w:r>
+      <w:r>
+        <w:t xml:space="preserve">completo del mensaje, sin plantillas aprobadas.</w:t>
+      </w:r>
+    </w:p>
+    <w:p>
+      <w:pPr>
+        <w:pStyle w:val="BodyText"/>
+      </w:pPr>
+      <w:r>
+        <w:t xml:space="preserve">Es solo para pruebas: en el sandbox cada número debe unirse antes enviando</w:t>
+      </w:r>
+      <w:r>
+        <w:t xml:space="preserve"> </w:t>
+      </w:r>
+      <w:r>
+        <w:t xml:space="preserve">un código. La entrega a la clínica sigue siendo el modo</w:t>
+      </w:r>
+      <w:r>
+        <w:t xml:space="preserve"> </w:t>
+      </w:r>
+      <w:r>
+        <w:rPr>
+          <w:rStyle w:val="VerbatimChar"/>
+        </w:rPr>
+        <w:t xml:space="preserve">manual</w:t>
+      </w:r>
+      <w:r>
+        <w:t xml:space="preserve">, como</w:t>
+      </w:r>
+      <w:r>
+        <w:t xml:space="preserve"> </w:t>
+      </w:r>
+      <w:r>
+        <w:t xml:space="preserve">respaldo, o el modo</w:t>
+      </w:r>
+      <w:r>
+        <w:t xml:space="preserve"> </w:t>
+      </w:r>
+      <w:r>
+        <w:rPr>
+          <w:rStyle w:val="VerbatimChar"/>
+        </w:rPr>
+        <w:t xml:space="preserve">api</w:t>
+      </w:r>
+      <w:r>
+        <w:t xml:space="preserve"> </w:t>
+      </w:r>
+      <w:r>
+        <w:t xml:space="preserve">cuando la clínica tenga su cuenta de Meta.</w:t>
+      </w:r>
+      <w:r>
+        <w:t xml:space="preserve"> </w:t>
+      </w:r>
+      <w:r>
+        <w:t xml:space="preserve">Cambiar de uno a otro es solo la variable</w:t>
+      </w:r>
+      <w:r>
+        <w:t xml:space="preserve"> </w:t>
+      </w:r>
+      <w:r>
+        <w:rPr>
+          <w:rStyle w:val="VerbatimChar"/>
+        </w:rPr>
+        <w:t xml:space="preserve">WHATSAPP_MODO</w:t>
+      </w:r>
+      <w:r>
+        <w:t xml:space="preserve">.</w:t>
+      </w:r>
+    </w:p>
+    <w:p>
+      <w:pPr>
+        <w:pStyle w:val="BodyText"/>
+      </w:pPr>
+      <w:r>
+        <w:t xml:space="preserve">Si el envío automático falla, la cita igual queda registrada y la API</w:t>
+      </w:r>
+      <w:r>
+        <w:t xml:space="preserve"> </w:t>
+      </w:r>
+      <w:r>
+        <w:t xml:space="preserve">devuelve el enlace de WhatsApp con el texto listo, para que la secretaria</w:t>
+      </w:r>
+      <w:r>
+        <w:t xml:space="preserve"> </w:t>
+      </w:r>
+      <w:r>
+        <w:t xml:space="preserve">lo envíe a mano desde el panel.</w:t>
+      </w:r>
+    </w:p>
     <w:bookmarkEnd w:id="42"/>
+    <w:bookmarkEnd w:id="43"/>
     <w:sectPr/>
   </w:body>
 </w:document>

</xml_diff>

<commit_message>
docs: política de datos 1.1 (decisión 26)
</commit_message>
<xml_diff>
--- a/docs/para-drive/Decisiones técnicas.docx
+++ b/docs/para-drive/Decisiones técnicas.docx
@@ -2,7 +2,7 @@
 <file path=word/document.xml><?xml version="1.0" encoding="utf-8"?>
 <w:document xmlns:w="http://schemas.openxmlformats.org/wordprocessingml/2006/main" xmlns:m="http://schemas.openxmlformats.org/officeDocument/2006/math" xmlns:r="http://schemas.openxmlformats.org/officeDocument/2006/relationships" xmlns:o="urn:schemas-microsoft-com:office:office" xmlns:v="urn:schemas-microsoft-com:vml" xmlns:w10="urn:schemas-microsoft-com:office:word" xmlns:a="http://schemas.openxmlformats.org/drawingml/2006/main" xmlns:pic="http://schemas.openxmlformats.org/drawingml/2006/picture" xmlns:wp="http://schemas.openxmlformats.org/drawingml/2006/wordprocessingDrawing">
   <w:body>
-    <w:bookmarkStart w:id="46" w:name="decisiones-técnicas"/>
+    <w:bookmarkStart w:id="47" w:name="decisiones-técnicas"/>
     <w:p>
       <w:pPr>
         <w:pStyle w:val="Heading1"/>
@@ -3807,7 +3807,244 @@
       </w:r>
     </w:p>
     <w:bookmarkEnd w:id="45"/>
+    <w:bookmarkStart w:id="46" w:name="X7eca425ba370a394b88c9aa089740e3033a0618"/>
+    <w:p>
+      <w:pPr>
+        <w:pStyle w:val="Heading2"/>
+      </w:pPr>
+      <w:r>
+        <w:t xml:space="preserve">26. Política de tratamiento de datos, versión 1.1 (9 de octubre)</w:t>
+      </w:r>
+    </w:p>
+    <w:p>
+      <w:pPr>
+        <w:pStyle w:val="FirstParagraph"/>
+      </w:pPr>
+      <w:r>
+        <w:rPr>
+          <w:rStyle w:val="VerbatimChar"/>
+        </w:rPr>
+        <w:t xml:space="preserve">politica-datos.html</w:t>
+      </w:r>
+      <w:r>
+        <w:t xml:space="preserve"> </w:t>
+      </w:r>
+      <w:r>
+        <w:t xml:space="preserve">se reescribió para el flujo actual: sin cuentas de</w:t>
+      </w:r>
+      <w:r>
+        <w:t xml:space="preserve"> </w:t>
+      </w:r>
+      <w:r>
+        <w:t xml:space="preserve">paciente, con historia clínica, motivo de consulta, mensajes por WhatsApp y</w:t>
+      </w:r>
+      <w:r>
+        <w:t xml:space="preserve"> </w:t>
+      </w:r>
+      <w:r>
+        <w:t xml:space="preserve">los datos nuevos del formulario. Sigue el contenido mínimo del Decreto 1377</w:t>
+      </w:r>
+      <w:r>
+        <w:t xml:space="preserve"> </w:t>
+      </w:r>
+      <w:r>
+        <w:t xml:space="preserve">de 2013 (compilado en el Decreto 1074 de 2015): responsable, finalidades,</w:t>
+      </w:r>
+      <w:r>
+        <w:t xml:space="preserve"> </w:t>
+      </w:r>
+      <w:r>
+        <w:t xml:space="preserve">derechos, área que atiende las solicitudes, procedimiento y vigencia.</w:t>
+      </w:r>
+    </w:p>
+    <w:p>
+      <w:pPr>
+        <w:numPr>
+          <w:ilvl w:val="0"/>
+          <w:numId w:val="1005"/>
+        </w:numPr>
+        <w:pStyle w:val="Compact"/>
+      </w:pPr>
+      <w:r>
+        <w:rPr>
+          <w:bCs/>
+          <w:b/>
+        </w:rPr>
+        <w:t xml:space="preserve">Datos sensibles y menores:</w:t>
+      </w:r>
+      <w:r>
+        <w:t xml:space="preserve"> </w:t>
+      </w:r>
+      <w:r>
+        <w:t xml:space="preserve">la historia clínica y el motivo de consulta</w:t>
+      </w:r>
+      <w:r>
+        <w:t xml:space="preserve"> </w:t>
+      </w:r>
+      <w:r>
+        <w:t xml:space="preserve">son datos de salud; la autorización en el consultorio es explícita y por</w:t>
+      </w:r>
+      <w:r>
+        <w:t xml:space="preserve"> </w:t>
+      </w:r>
+      <w:r>
+        <w:t xml:space="preserve">escrito. Para menores autoriza el representante legal.</w:t>
+      </w:r>
+    </w:p>
+    <w:p>
+      <w:pPr>
+        <w:numPr>
+          <w:ilvl w:val="0"/>
+          <w:numId w:val="1005"/>
+        </w:numPr>
+        <w:pStyle w:val="Compact"/>
+      </w:pPr>
+      <w:r>
+        <w:rPr>
+          <w:bCs/>
+          <w:b/>
+        </w:rPr>
+        <w:t xml:space="preserve">Encargados y transmisión internacional:</w:t>
+      </w:r>
+      <w:r>
+        <w:t xml:space="preserve"> </w:t>
+      </w:r>
+      <w:r>
+        <w:t xml:space="preserve">Meta (WhatsApp) recibe el</w:t>
+      </w:r>
+      <w:r>
+        <w:t xml:space="preserve"> </w:t>
+      </w:r>
+      <w:r>
+        <w:t xml:space="preserve">celular y el texto del aviso; el proveedor de alojamiento se completa al</w:t>
+      </w:r>
+      <w:r>
+        <w:t xml:space="preserve"> </w:t>
+      </w:r>
+      <w:r>
+        <w:t xml:space="preserve">publicar. Los mensajes no llevan datos de salud.</w:t>
+      </w:r>
+    </w:p>
+    <w:p>
+      <w:pPr>
+        <w:numPr>
+          <w:ilvl w:val="0"/>
+          <w:numId w:val="1005"/>
+        </w:numPr>
+        <w:pStyle w:val="Compact"/>
+      </w:pPr>
+      <w:r>
+        <w:rPr>
+          <w:bCs/>
+          <w:b/>
+        </w:rPr>
+        <w:t xml:space="preserve">Conservación:</w:t>
+      </w:r>
+      <w:r>
+        <w:t xml:space="preserve"> </w:t>
+      </w:r>
+      <w:r>
+        <w:t xml:space="preserve">historia clínica mínimo 15 años desde la última atención</w:t>
+      </w:r>
+      <w:r>
+        <w:t xml:space="preserve"> </w:t>
+      </w:r>
+      <w:r>
+        <w:t xml:space="preserve">(Resolución 839 de 2017), por lo que no se elimina aunque se pida.</w:t>
+      </w:r>
+    </w:p>
+    <w:p>
+      <w:pPr>
+        <w:numPr>
+          <w:ilvl w:val="0"/>
+          <w:numId w:val="1005"/>
+        </w:numPr>
+        <w:pStyle w:val="Compact"/>
+      </w:pPr>
+      <w:r>
+        <w:rPr>
+          <w:bCs/>
+          <w:b/>
+        </w:rPr>
+        <w:t xml:space="preserve">Plazos:</w:t>
+      </w:r>
+      <w:r>
+        <w:t xml:space="preserve"> </w:t>
+      </w:r>
+      <w:r>
+        <w:t xml:space="preserve">consultas 10 días hábiles (+5) y reclamos 15 días hábiles (+8),</w:t>
+      </w:r>
+      <w:r>
+        <w:t xml:space="preserve"> </w:t>
+      </w:r>
+      <w:r>
+        <w:t xml:space="preserve">artículos 14 y 15 de la Ley 1581.</w:t>
+      </w:r>
+    </w:p>
+    <w:p>
+      <w:pPr>
+        <w:numPr>
+          <w:ilvl w:val="0"/>
+          <w:numId w:val="1005"/>
+        </w:numPr>
+        <w:pStyle w:val="Compact"/>
+      </w:pPr>
+      <w:r>
+        <w:rPr>
+          <w:rStyle w:val="VerbatimChar"/>
+        </w:rPr>
+        <w:t xml:space="preserve">VERSION_POLITICA_DATOS</w:t>
+      </w:r>
+      <w:r>
+        <w:t xml:space="preserve"> </w:t>
+      </w:r>
+      <w:r>
+        <w:t xml:space="preserve">pasa a</w:t>
+      </w:r>
+      <w:r>
+        <w:t xml:space="preserve"> </w:t>
+      </w:r>
+      <w:r>
+        <w:rPr>
+          <w:rStyle w:val="VerbatimChar"/>
+        </w:rPr>
+        <w:t xml:space="preserve">1.1</w:t>
+      </w:r>
+      <w:r>
+        <w:t xml:space="preserve"> </w:t>
+      </w:r>
+      <w:r>
+        <w:t xml:space="preserve">en los modelos de citas y pacientes,</w:t>
+      </w:r>
+      <w:r>
+        <w:t xml:space="preserve"> </w:t>
+      </w:r>
+      <w:r>
+        <w:t xml:space="preserve">para que cada autorización quede ligada al texto que se aceptó.</w:t>
+      </w:r>
+    </w:p>
+    <w:p>
+      <w:pPr>
+        <w:pStyle w:val="FirstParagraph"/>
+      </w:pPr>
+      <w:r>
+        <w:t xml:space="preserve">Quedan marcados en ámbar los datos que solo puede dar el consultorio: nombre</w:t>
+      </w:r>
+      <w:r>
+        <w:t xml:space="preserve"> </w:t>
+      </w:r>
+      <w:r>
+        <w:t xml:space="preserve">legal y NIT o cédula del responsable, correo para solicitudes, quién las</w:t>
+      </w:r>
+      <w:r>
+        <w:t xml:space="preserve"> </w:t>
+      </w:r>
+      <w:r>
+        <w:t xml:space="preserve">atiende, proveedor de alojamiento y fecha de vigencia.</w:t>
+      </w:r>
+    </w:p>
     <w:bookmarkEnd w:id="46"/>
+    <w:bookmarkEnd w:id="47"/>
     <w:sectPr/>
   </w:body>
 </w:document>
@@ -4003,6 +4240,9 @@
     <w:abstractNumId w:val="991"/>
   </w:num>
   <w:num w:numId="1004">
+    <w:abstractNumId w:val="991"/>
+  </w:num>
+  <w:num w:numId="1005">
     <w:abstractNumId w:val="991"/>
   </w:num>
 </w:numbering>

</xml_diff>

<commit_message>
Docs: decisión 28 y filas del panel más simples
Se agrega la decisión 28, se ajustan el manual de usuario y el contrato de la API y se regeneran los Word de docs/para-drive.
</commit_message>
<xml_diff>
--- a/docs/para-drive/Decisiones técnicas.docx
+++ b/docs/para-drive/Decisiones técnicas.docx
@@ -2,7 +2,7 @@
 <file path=word/document.xml><?xml version="1.0" encoding="utf-8"?>
 <w:document xmlns:w="http://schemas.openxmlformats.org/wordprocessingml/2006/main" xmlns:m="http://schemas.openxmlformats.org/officeDocument/2006/math" xmlns:r="http://schemas.openxmlformats.org/officeDocument/2006/relationships" xmlns:o="urn:schemas-microsoft-com:office:office" xmlns:v="urn:schemas-microsoft-com:vml" xmlns:w10="urn:schemas-microsoft-com:office:word" xmlns:a="http://schemas.openxmlformats.org/drawingml/2006/main" xmlns:pic="http://schemas.openxmlformats.org/drawingml/2006/picture" xmlns:wp="http://schemas.openxmlformats.org/drawingml/2006/wordprocessingDrawing">
   <w:body>
-    <w:bookmarkStart w:id="48" w:name="decisiones-técnicas"/>
+    <w:bookmarkStart w:id="49" w:name="decisiones-técnicas"/>
     <w:p>
       <w:pPr>
         <w:pStyle w:val="Heading1"/>
@@ -4413,7 +4413,242 @@
       </w:r>
     </w:p>
     <w:bookmarkEnd w:id="47"/>
+    <w:bookmarkStart w:id="48" w:name="filas-del-panel-más-simples-9-de-octubre"/>
+    <w:p>
+      <w:pPr>
+        <w:pStyle w:val="Heading2"/>
+      </w:pPr>
+      <w:r>
+        <w:t xml:space="preserve">28. Filas del panel más simples (9 de octubre)</w:t>
+      </w:r>
+    </w:p>
+    <w:p>
+      <w:pPr>
+        <w:pStyle w:val="FirstParagraph"/>
+      </w:pPr>
+      <w:r>
+        <w:t xml:space="preserve">Como las citas de la web ya llegan confirmadas, la secretaria no necesita</w:t>
+      </w:r>
+      <w:r>
+        <w:t xml:space="preserve"> </w:t>
+      </w:r>
+      <w:r>
+        <w:t xml:space="preserve">decidir nada al verlas, y se quitó lo que sobraba en la agenda y en Inicio:</w:t>
+      </w:r>
+    </w:p>
+    <w:p>
+      <w:pPr>
+        <w:numPr>
+          <w:ilvl w:val="0"/>
+          <w:numId w:val="1007"/>
+        </w:numPr>
+        <w:pStyle w:val="Compact"/>
+      </w:pPr>
+      <w:r>
+        <w:rPr>
+          <w:bCs/>
+          <w:b/>
+        </w:rPr>
+        <w:t xml:space="preserve">La fila de cada cita ya no muestra documento ni teléfono.</w:t>
+      </w:r>
+      <w:r>
+        <w:t xml:space="preserve"> </w:t>
+      </w:r>
+      <w:r>
+        <w:t xml:space="preserve">Siguen en la</w:t>
+      </w:r>
+      <w:r>
+        <w:t xml:space="preserve"> </w:t>
+      </w:r>
+      <w:r>
+        <w:t xml:space="preserve">ficha del paciente y la búsqueda por nombre, documento o celular funciona</w:t>
+      </w:r>
+      <w:r>
+        <w:t xml:space="preserve"> </w:t>
+      </w:r>
+      <w:r>
+        <w:t xml:space="preserve">igual. Es un cambio solo de la pantalla: la API sigue devolviendo esos datos.</w:t>
+      </w:r>
+    </w:p>
+    <w:p>
+      <w:pPr>
+        <w:numPr>
+          <w:ilvl w:val="0"/>
+          <w:numId w:val="1007"/>
+        </w:numPr>
+        <w:pStyle w:val="Compact"/>
+      </w:pPr>
+      <w:r>
+        <w:rPr>
+          <w:bCs/>
+          <w:b/>
+        </w:rPr>
+        <w:t xml:space="preserve">En</w:t>
+      </w:r>
+      <w:r>
+        <w:rPr>
+          <w:bCs/>
+          <w:b/>
+        </w:rPr>
+        <w:t xml:space="preserve"> </w:t>
+      </w:r>
+      <w:r>
+        <w:rPr>
+          <w:bCs/>
+          <w:b/>
+        </w:rPr>
+        <w:t xml:space="preserve">“</w:t>
+      </w:r>
+      <w:r>
+        <w:rPr>
+          <w:bCs/>
+          <w:b/>
+        </w:rPr>
+        <w:t xml:space="preserve">Novedades de la web</w:t>
+      </w:r>
+      <w:r>
+        <w:rPr>
+          <w:bCs/>
+          <w:b/>
+        </w:rPr>
+        <w:t xml:space="preserve">”</w:t>
+      </w:r>
+      <w:r>
+        <w:rPr>
+          <w:bCs/>
+          <w:b/>
+        </w:rPr>
+        <w:t xml:space="preserve"> </w:t>
+      </w:r>
+      <w:r>
+        <w:rPr>
+          <w:bCs/>
+          <w:b/>
+        </w:rPr>
+        <w:t xml:space="preserve">la cita nueva ya no lleva la etiqueta</w:t>
+      </w:r>
+      <w:r>
+        <w:rPr>
+          <w:bCs/>
+          <w:b/>
+        </w:rPr>
+        <w:t xml:space="preserve"> </w:t>
+      </w:r>
+      <w:r>
+        <w:rPr>
+          <w:bCs/>
+          <w:b/>
+        </w:rPr>
+        <w:t xml:space="preserve">“</w:t>
+      </w:r>
+      <w:r>
+        <w:rPr>
+          <w:bCs/>
+          <w:b/>
+        </w:rPr>
+        <w:t xml:space="preserve">Pedida</w:t>
+      </w:r>
+      <w:r>
+        <w:rPr>
+          <w:bCs/>
+          <w:b/>
+        </w:rPr>
+        <w:t xml:space="preserve"> </w:t>
+      </w:r>
+      <w:r>
+        <w:rPr>
+          <w:bCs/>
+          <w:b/>
+        </w:rPr>
+        <w:t xml:space="preserve">por la web</w:t>
+      </w:r>
+      <w:r>
+        <w:rPr>
+          <w:bCs/>
+          <w:b/>
+        </w:rPr>
+        <w:t xml:space="preserve">”</w:t>
+      </w:r>
+      <w:r>
+        <w:rPr>
+          <w:bCs/>
+          <w:b/>
+        </w:rPr>
+        <w:t xml:space="preserve"> </w:t>
+      </w:r>
+      <w:r>
+        <w:rPr>
+          <w:bCs/>
+          <w:b/>
+        </w:rPr>
+        <w:t xml:space="preserve">ni la hora en que se pidió.</w:t>
+      </w:r>
+      <w:r>
+        <w:t xml:space="preserve"> </w:t>
+      </w:r>
+      <w:r>
+        <w:t xml:space="preserve">Se conservan las de</w:t>
+      </w:r>
+      <w:r>
+        <w:t xml:space="preserve"> </w:t>
+      </w:r>
+      <w:r>
+        <w:t xml:space="preserve">“</w:t>
+      </w:r>
+      <w:r>
+        <w:t xml:space="preserve">El paciente</w:t>
+      </w:r>
+      <w:r>
+        <w:t xml:space="preserve"> </w:t>
+      </w:r>
+      <w:r>
+        <w:t xml:space="preserve">cambió la hora</w:t>
+      </w:r>
+      <w:r>
+        <w:t xml:space="preserve">”</w:t>
+      </w:r>
+      <w:r>
+        <w:t xml:space="preserve"> </w:t>
+      </w:r>
+      <w:r>
+        <w:t xml:space="preserve">y</w:t>
+      </w:r>
+      <w:r>
+        <w:t xml:space="preserve"> </w:t>
+      </w:r>
+      <w:r>
+        <w:t xml:space="preserve">“</w:t>
+      </w:r>
+      <w:r>
+        <w:t xml:space="preserve">El paciente la canceló</w:t>
+      </w:r>
+      <w:r>
+        <w:t xml:space="preserve">”</w:t>
+      </w:r>
+      <w:r>
+        <w:t xml:space="preserve">, con cuándo pasó, porque ahí sí</w:t>
+      </w:r>
+      <w:r>
+        <w:t xml:space="preserve"> </w:t>
+      </w:r>
+      <w:r>
+        <w:t xml:space="preserve">hay algo que la secretaria debe saber.</w:t>
+      </w:r>
+    </w:p>
+    <w:p>
+      <w:pPr>
+        <w:numPr>
+          <w:ilvl w:val="0"/>
+          <w:numId w:val="1007"/>
+        </w:numPr>
+        <w:pStyle w:val="Compact"/>
+      </w:pPr>
+      <w:r>
+        <w:t xml:space="preserve">El texto del modo demostración dejó de decir que la cita queda pendiente.</w:t>
+      </w:r>
+    </w:p>
     <w:bookmarkEnd w:id="48"/>
+    <w:bookmarkEnd w:id="49"/>
     <w:sectPr/>
   </w:body>
 </w:document>
@@ -4615,6 +4850,9 @@
     <w:abstractNumId w:val="991"/>
   </w:num>
   <w:num w:numId="1006">
+    <w:abstractNumId w:val="991"/>
+  </w:num>
+  <w:num w:numId="1007">
     <w:abstractNumId w:val="991"/>
   </w:num>
 </w:numbering>

</xml_diff>

<commit_message>
Docs: decisión 29 (horarios día por día) y manuales
</commit_message>
<xml_diff>
--- a/docs/para-drive/Decisiones técnicas.docx
+++ b/docs/para-drive/Decisiones técnicas.docx
@@ -2,7 +2,7 @@
 <file path=word/document.xml><?xml version="1.0" encoding="utf-8"?>
 <w:document xmlns:w="http://schemas.openxmlformats.org/wordprocessingml/2006/main" xmlns:m="http://schemas.openxmlformats.org/officeDocument/2006/math" xmlns:r="http://schemas.openxmlformats.org/officeDocument/2006/relationships" xmlns:o="urn:schemas-microsoft-com:office:office" xmlns:v="urn:schemas-microsoft-com:vml" xmlns:w10="urn:schemas-microsoft-com:office:word" xmlns:a="http://schemas.openxmlformats.org/drawingml/2006/main" xmlns:pic="http://schemas.openxmlformats.org/drawingml/2006/picture" xmlns:wp="http://schemas.openxmlformats.org/drawingml/2006/wordprocessingDrawing">
   <w:body>
-    <w:bookmarkStart w:id="49" w:name="decisiones-técnicas"/>
+    <w:bookmarkStart w:id="50" w:name="decisiones-técnicas"/>
     <w:p>
       <w:pPr>
         <w:pStyle w:val="Heading1"/>
@@ -4648,7 +4648,254 @@
       </w:r>
     </w:p>
     <w:bookmarkEnd w:id="48"/>
+    <w:bookmarkStart w:id="49" w:name="Xa073654a3da554aff3666e5aa7de72455a6cf37"/>
+    <w:p>
+      <w:pPr>
+        <w:pStyle w:val="Heading2"/>
+      </w:pPr>
+      <w:r>
+        <w:t xml:space="preserve">29. Horarios: editar día por día (10 de octubre)</w:t>
+      </w:r>
+    </w:p>
+    <w:p>
+      <w:pPr>
+        <w:pStyle w:val="FirstParagraph"/>
+      </w:pPr>
+      <w:r>
+        <w:t xml:space="preserve">La sección de horarios resultaba confusa: «Publicar horas» abría un diálogo</w:t>
+      </w:r>
+      <w:r>
+        <w:t xml:space="preserve"> </w:t>
+      </w:r>
+      <w:r>
+        <w:t xml:space="preserve">con 25 casillas que no mostraba lo que ya estaba publicado, solo dejaba</w:t>
+      </w:r>
+      <w:r>
+        <w:t xml:space="preserve"> </w:t>
+      </w:r>
+      <w:r>
+        <w:t xml:space="preserve">elegir días de la semana que se estaba viendo, y una hora se quitaba</w:t>
+      </w:r>
+      <w:r>
+        <w:t xml:space="preserve"> </w:t>
+      </w:r>
+      <w:r>
+        <w:t xml:space="preserve">tocando su recuadro en la semana (con una confirmación por cada una). Se</w:t>
+      </w:r>
+      <w:r>
+        <w:t xml:space="preserve"> </w:t>
+      </w:r>
+      <w:r>
+        <w:t xml:space="preserve">cambió por un editor por día:</w:t>
+      </w:r>
+    </w:p>
+    <w:p>
+      <w:pPr>
+        <w:numPr>
+          <w:ilvl w:val="0"/>
+          <w:numId w:val="1008"/>
+        </w:numPr>
+        <w:pStyle w:val="Compact"/>
+      </w:pPr>
+      <w:r>
+        <w:rPr>
+          <w:bCs/>
+          <w:b/>
+        </w:rPr>
+        <w:t xml:space="preserve">Cada día de la semana tiene un botón «Editar».</w:t>
+      </w:r>
+      <w:r>
+        <w:t xml:space="preserve"> </w:t>
+      </w:r>
+      <w:r>
+        <w:t xml:space="preserve">Abre el horario de ese</w:t>
+      </w:r>
+      <w:r>
+        <w:t xml:space="preserve"> </w:t>
+      </w:r>
+      <w:r>
+        <w:t xml:space="preserve">día con las horas ya publicadas marcadas (✓). Lo marcado es lo que los</w:t>
+      </w:r>
+      <w:r>
+        <w:t xml:space="preserve"> </w:t>
+      </w:r>
+      <w:r>
+        <w:t xml:space="preserve">pacientes pueden elegir: se marca o desmarca con un toque y hay atajos</w:t>
+      </w:r>
+      <w:r>
+        <w:t xml:space="preserve"> </w:t>
+      </w:r>
+      <w:r>
+        <w:t xml:space="preserve">(Mañana, Tarde, Mañana y tarde, Desmarcar todo). Lo que se ve es lo que</w:t>
+      </w:r>
+      <w:r>
+        <w:t xml:space="preserve"> </w:t>
+      </w:r>
+      <w:r>
+        <w:t xml:space="preserve">queda.</w:t>
+      </w:r>
+    </w:p>
+    <w:p>
+      <w:pPr>
+        <w:numPr>
+          <w:ilvl w:val="0"/>
+          <w:numId w:val="1008"/>
+        </w:numPr>
+        <w:pStyle w:val="Compact"/>
+      </w:pPr>
+      <w:r>
+        <w:rPr>
+          <w:bCs/>
+          <w:b/>
+        </w:rPr>
+        <w:t xml:space="preserve">«Usar este horario en otros días»</w:t>
+      </w:r>
+      <w:r>
+        <w:t xml:space="preserve"> </w:t>
+      </w:r>
+      <w:r>
+        <w:t xml:space="preserve">reemplaza a «Publicar horas»: se</w:t>
+      </w:r>
+      <w:r>
+        <w:t xml:space="preserve"> </w:t>
+      </w:r>
+      <w:r>
+        <w:t xml:space="preserve">eligen otros días de la semana y cuántas semanas repetir (1, 2, 4 u 8), y</w:t>
+      </w:r>
+      <w:r>
+        <w:t xml:space="preserve"> </w:t>
+      </w:r>
+      <w:r>
+        <w:t xml:space="preserve">esos días quedan con las mismas horas.</w:t>
+      </w:r>
+    </w:p>
+    <w:p>
+      <w:pPr>
+        <w:numPr>
+          <w:ilvl w:val="0"/>
+          <w:numId w:val="1008"/>
+        </w:numPr>
+        <w:pStyle w:val="Compact"/>
+      </w:pPr>
+      <w:r>
+        <w:rPr>
+          <w:bCs/>
+          <w:b/>
+        </w:rPr>
+        <w:t xml:space="preserve">Antes de guardar se ve el resumen</w:t>
+      </w:r>
+      <w:r>
+        <w:t xml:space="preserve"> </w:t>
+      </w:r>
+      <w:r>
+        <w:t xml:space="preserve">(cuántas horas se publican y cuántas</w:t>
+      </w:r>
+      <w:r>
+        <w:t xml:space="preserve"> </w:t>
+      </w:r>
+      <w:r>
+        <w:t xml:space="preserve">se quitan). Al guardar solo se envían las diferencias, con las rutas que</w:t>
+      </w:r>
+      <w:r>
+        <w:t xml:space="preserve"> </w:t>
+      </w:r>
+      <w:r>
+        <w:t xml:space="preserve">ya existían (</w:t>
+      </w:r>
+      <w:r>
+        <w:rPr>
+          <w:rStyle w:val="VerbatimChar"/>
+        </w:rPr>
+        <w:t xml:space="preserve">POST</w:t>
+      </w:r>
+      <w:r>
+        <w:t xml:space="preserve"> </w:t>
+      </w:r>
+      <w:r>
+        <w:t xml:space="preserve">de franjas agrupando las fechas que reciben las mismas</w:t>
+      </w:r>
+      <w:r>
+        <w:t xml:space="preserve"> </w:t>
+      </w:r>
+      <w:r>
+        <w:t xml:space="preserve">horas y</w:t>
+      </w:r>
+      <w:r>
+        <w:t xml:space="preserve"> </w:t>
+      </w:r>
+      <w:r>
+        <w:rPr>
+          <w:rStyle w:val="VerbatimChar"/>
+        </w:rPr>
+        <w:t xml:space="preserve">DELETE</w:t>
+      </w:r>
+      <w:r>
+        <w:t xml:space="preserve"> </w:t>
+      </w:r>
+      <w:r>
+        <w:t xml:space="preserve">de cada franja libre que sobra), así que no cambió la API.</w:t>
+      </w:r>
+    </w:p>
+    <w:p>
+      <w:pPr>
+        <w:numPr>
+          <w:ilvl w:val="0"/>
+          <w:numId w:val="1008"/>
+        </w:numPr>
+        <w:pStyle w:val="Compact"/>
+      </w:pPr>
+      <w:r>
+        <w:rPr>
+          <w:bCs/>
+          <w:b/>
+        </w:rPr>
+        <w:t xml:space="preserve">Las horas con cita y las que ya pasaron no se tocan.</w:t>
+      </w:r>
+      <w:r>
+        <w:t xml:space="preserve"> </w:t>
+      </w:r>
+      <w:r>
+        <w:t xml:space="preserve">En el editor la</w:t>
+      </w:r>
+      <w:r>
+        <w:t xml:space="preserve"> </w:t>
+      </w:r>
+      <w:r>
+        <w:t xml:space="preserve">hora con cita aparece con el nombre del paciente y bloqueada; si al</w:t>
+      </w:r>
+      <w:r>
+        <w:t xml:space="preserve"> </w:t>
+      </w:r>
+      <w:r>
+        <w:t xml:space="preserve">guardar alguna no se pudo quitar (por ejemplo, porque la acaban de</w:t>
+      </w:r>
+      <w:r>
+        <w:t xml:space="preserve"> </w:t>
+      </w:r>
+      <w:r>
+        <w:t xml:space="preserve">agendar), el aviso lo dice.</w:t>
+      </w:r>
+    </w:p>
+    <w:p>
+      <w:pPr>
+        <w:numPr>
+          <w:ilvl w:val="0"/>
+          <w:numId w:val="1008"/>
+        </w:numPr>
+        <w:pStyle w:val="Compact"/>
+      </w:pPr>
+      <w:r>
+        <w:t xml:space="preserve">En la semana los recuadros de hora ya no son botones: se acabó el riesgo</w:t>
+      </w:r>
+      <w:r>
+        <w:t xml:space="preserve"> </w:t>
+      </w:r>
+      <w:r>
+        <w:t xml:space="preserve">de quitar una hora por un clic sin querer.</w:t>
+      </w:r>
+    </w:p>
     <w:bookmarkEnd w:id="49"/>
+    <w:bookmarkEnd w:id="50"/>
     <w:sectPr/>
   </w:body>
 </w:document>
@@ -4853,6 +5100,9 @@
     <w:abstractNumId w:val="991"/>
   </w:num>
   <w:num w:numId="1007">
+    <w:abstractNumId w:val="991"/>
+  </w:num>
+  <w:num w:numId="1008">
     <w:abstractNumId w:val="991"/>
   </w:num>
 </w:numbering>

</xml_diff>

<commit_message>
Frontend: rediseño visual con más profundidad (solo estilos)
Interfaz más moderna, limpia y dinámica sin cambiar contenido ni
funcionamiento: un solo color de marca, degradados suaves del mismo
matiz, sombras en cuatro niveles, radios más amplios, controles de
44-46 px, hover sutil, encabezado de cristal y diálogos con fundido.
Aplica a la página pública, agendar y gestionar cita, política de datos
y a los paneles (claro y oscuro, escritorio, tablet y celular).

Nuevos tokens en tokens.css (sombras, degradados, radios, anillo de
foco); los colores siguen viviendo solo en ese archivo.
Documentado en la decisión 31 y en el manual técnico.
</commit_message>
<xml_diff>
--- a/docs/para-drive/Decisiones técnicas.docx
+++ b/docs/para-drive/Decisiones técnicas.docx
@@ -2,7 +2,7 @@
 <file path=word/document.xml><?xml version="1.0" encoding="utf-8"?>
 <w:document xmlns:w="http://schemas.openxmlformats.org/wordprocessingml/2006/main" xmlns:m="http://schemas.openxmlformats.org/officeDocument/2006/math" xmlns:r="http://schemas.openxmlformats.org/officeDocument/2006/relationships" xmlns:o="urn:schemas-microsoft-com:office:office" xmlns:v="urn:schemas-microsoft-com:vml" xmlns:w10="urn:schemas-microsoft-com:office:word" xmlns:a="http://schemas.openxmlformats.org/drawingml/2006/main" xmlns:pic="http://schemas.openxmlformats.org/drawingml/2006/picture" xmlns:wp="http://schemas.openxmlformats.org/drawingml/2006/wordprocessingDrawing">
   <w:body>
-    <w:bookmarkStart w:id="51" w:name="decisiones-técnicas"/>
+    <w:bookmarkStart w:id="52" w:name="decisiones-técnicas"/>
     <w:p>
       <w:pPr>
         <w:pStyle w:val="Heading1"/>
@@ -5602,7 +5602,576 @@
       </w:r>
     </w:p>
     <w:bookmarkEnd w:id="50"/>
+    <w:bookmarkStart w:id="51" w:name="X767fe003e94afd321e69850a08e4a47e21207a6"/>
+    <w:p>
+      <w:pPr>
+        <w:pStyle w:val="Heading2"/>
+      </w:pPr>
+      <w:r>
+        <w:t xml:space="preserve">31. Rediseño visual con más profundidad (15 de octubre)</w:t>
+      </w:r>
+    </w:p>
+    <w:p>
+      <w:pPr>
+        <w:pStyle w:val="FirstParagraph"/>
+      </w:pPr>
+      <w:r>
+        <w:t xml:space="preserve">Pedido: que la página se vea más moderna, limpia y dinámica, sin cambiar</w:t>
+      </w:r>
+      <w:r>
+        <w:t xml:space="preserve"> </w:t>
+      </w:r>
+      <w:r>
+        <w:t xml:space="preserve">el contenido ni el funcionamiento ni mezclar colores. Solo se tocaron</w:t>
+      </w:r>
+      <w:r>
+        <w:t xml:space="preserve"> </w:t>
+      </w:r>
+      <w:r>
+        <w:t xml:space="preserve">estilos (</w:t>
+      </w:r>
+      <w:r>
+        <w:rPr>
+          <w:rStyle w:val="VerbatimChar"/>
+        </w:rPr>
+        <w:t xml:space="preserve">css/*.css</w:t>
+      </w:r>
+      <w:r>
+        <w:t xml:space="preserve">, el bloque de estilos de</w:t>
+      </w:r>
+      <w:r>
+        <w:t xml:space="preserve"> </w:t>
+      </w:r>
+      <w:r>
+        <w:rPr>
+          <w:rStyle w:val="VerbatimChar"/>
+        </w:rPr>
+        <w:t xml:space="preserve">politica-datos.html</w:t>
+      </w:r>
+      <w:r>
+        <w:t xml:space="preserve"> </w:t>
+      </w:r>
+      <w:r>
+        <w:t xml:space="preserve">y un</w:t>
+      </w:r>
+      <w:r>
+        <w:t xml:space="preserve"> </w:t>
+      </w:r>
+      <w:r>
+        <w:t xml:space="preserve">color en línea del pie de</w:t>
+      </w:r>
+      <w:r>
+        <w:t xml:space="preserve"> </w:t>
+      </w:r>
+      <w:r>
+        <w:rPr>
+          <w:rStyle w:val="VerbatimChar"/>
+        </w:rPr>
+        <w:t xml:space="preserve">index.html</w:t>
+      </w:r>
+      <w:r>
+        <w:t xml:space="preserve">); ningún archivo</w:t>
+      </w:r>
+      <w:r>
+        <w:t xml:space="preserve"> </w:t>
+      </w:r>
+      <w:r>
+        <w:rPr>
+          <w:rStyle w:val="VerbatimChar"/>
+        </w:rPr>
+        <w:t xml:space="preserve">.js</w:t>
+      </w:r>
+      <w:r>
+        <w:t xml:space="preserve">.</w:t>
+      </w:r>
+    </w:p>
+    <w:p>
+      <w:pPr>
+        <w:numPr>
+          <w:ilvl w:val="0"/>
+          <w:numId w:val="1010"/>
+        </w:numPr>
+        <w:pStyle w:val="Compact"/>
+      </w:pPr>
+      <w:r>
+        <w:rPr>
+          <w:bCs/>
+          <w:b/>
+        </w:rPr>
+        <w:t xml:space="preserve">Un solo color de marca.</w:t>
+      </w:r>
+      <w:r>
+        <w:t xml:space="preserve"> </w:t>
+      </w:r>
+      <w:r>
+        <w:t xml:space="preserve">Se mantiene el morado del logo y sus</w:t>
+      </w:r>
+      <w:r>
+        <w:t xml:space="preserve"> </w:t>
+      </w:r>
+      <w:r>
+        <w:t xml:space="preserve">lavandas. La sensación de «menos plano» sale de la profundidad, no de</w:t>
+      </w:r>
+      <w:r>
+        <w:t xml:space="preserve"> </w:t>
+      </w:r>
+      <w:r>
+        <w:t xml:space="preserve">más colores: degradados muy suaves del mismo matiz</w:t>
+      </w:r>
+      <w:r>
+        <w:t xml:space="preserve"> </w:t>
+      </w:r>
+      <w:r>
+        <w:t xml:space="preserve">(</w:t>
+      </w:r>
+      <w:r>
+        <w:rPr>
+          <w:rStyle w:val="VerbatimChar"/>
+        </w:rPr>
+        <w:t xml:space="preserve">--degradado-marca</w:t>
+      </w:r>
+      <w:r>
+        <w:t xml:space="preserve">,</w:t>
+      </w:r>
+      <w:r>
+        <w:t xml:space="preserve"> </w:t>
+      </w:r>
+      <w:r>
+        <w:rPr>
+          <w:rStyle w:val="VerbatimChar"/>
+        </w:rPr>
+        <w:t xml:space="preserve">--degradado-tarjeta</w:t>
+      </w:r>
+      <w:r>
+        <w:t xml:space="preserve">,</w:t>
+      </w:r>
+      <w:r>
+        <w:t xml:space="preserve"> </w:t>
+      </w:r>
+      <w:r>
+        <w:rPr>
+          <w:rStyle w:val="VerbatimChar"/>
+        </w:rPr>
+        <w:t xml:space="preserve">--degradado-lavanda</w:t>
+      </w:r>
+      <w:r>
+        <w:t xml:space="preserve">) y un</w:t>
+      </w:r>
+      <w:r>
+        <w:t xml:space="preserve"> </w:t>
+      </w:r>
+      <w:r>
+        <w:t xml:space="preserve">velo de color fijo detrás de cada página (</w:t>
+      </w:r>
+      <w:r>
+        <w:rPr>
+          <w:rStyle w:val="VerbatimChar"/>
+        </w:rPr>
+        <w:t xml:space="preserve">--degradado-pagina</w:t>
+      </w:r>
+      <w:r>
+        <w:t xml:space="preserve">).</w:t>
+      </w:r>
+    </w:p>
+    <w:p>
+      <w:pPr>
+        <w:numPr>
+          <w:ilvl w:val="0"/>
+          <w:numId w:val="1010"/>
+        </w:numPr>
+        <w:pStyle w:val="Compact"/>
+      </w:pPr>
+      <w:r>
+        <w:rPr>
+          <w:bCs/>
+          <w:b/>
+        </w:rPr>
+        <w:t xml:space="preserve">Elevación en cuatro niveles</w:t>
+      </w:r>
+      <w:r>
+        <w:t xml:space="preserve"> </w:t>
+      </w:r>
+      <w:r>
+        <w:t xml:space="preserve">(</w:t>
+      </w:r>
+      <w:r>
+        <w:rPr>
+          <w:rStyle w:val="VerbatimChar"/>
+        </w:rPr>
+        <w:t xml:space="preserve">--sombra-sutil</w:t>
+      </w:r>
+      <w:r>
+        <w:t xml:space="preserve">,</w:t>
+      </w:r>
+      <w:r>
+        <w:t xml:space="preserve"> </w:t>
+      </w:r>
+      <w:r>
+        <w:rPr>
+          <w:rStyle w:val="VerbatimChar"/>
+        </w:rPr>
+        <w:t xml:space="preserve">--sombra-media</w:t>
+      </w:r>
+      <w:r>
+        <w:t xml:space="preserve">,</w:t>
+      </w:r>
+      <w:r>
+        <w:t xml:space="preserve"> </w:t>
+      </w:r>
+      <w:r>
+        <w:rPr>
+          <w:rStyle w:val="VerbatimChar"/>
+        </w:rPr>
+        <w:t xml:space="preserve">--sombra-realce</w:t>
+      </w:r>
+      <w:r>
+        <w:t xml:space="preserve">,</w:t>
+      </w:r>
+      <w:r>
+        <w:t xml:space="preserve"> </w:t>
+      </w:r>
+      <w:r>
+        <w:rPr>
+          <w:rStyle w:val="VerbatimChar"/>
+        </w:rPr>
+        <w:t xml:space="preserve">--sombra-flotante</w:t>
+      </w:r>
+      <w:r>
+        <w:t xml:space="preserve">), siempre con sombras en capas</w:t>
+      </w:r>
+      <w:r>
+        <w:t xml:space="preserve"> </w:t>
+      </w:r>
+      <w:r>
+        <w:t xml:space="preserve">teñidas de morado. Reposo → hover → menús y diálogos.</w:t>
+      </w:r>
+    </w:p>
+    <w:p>
+      <w:pPr>
+        <w:numPr>
+          <w:ilvl w:val="0"/>
+          <w:numId w:val="1010"/>
+        </w:numPr>
+        <w:pStyle w:val="Compact"/>
+      </w:pPr>
+      <w:r>
+        <w:rPr>
+          <w:bCs/>
+          <w:b/>
+        </w:rPr>
+        <w:t xml:space="preserve">Radios más amplios</w:t>
+      </w:r>
+      <w:r>
+        <w:t xml:space="preserve"> </w:t>
+      </w:r>
+      <w:r>
+        <w:t xml:space="preserve">(</w:t>
+      </w:r>
+      <w:r>
+        <w:rPr>
+          <w:rStyle w:val="VerbatimChar"/>
+        </w:rPr>
+        <w:t xml:space="preserve">--radio-sm</w:t>
+      </w:r>
+      <w:r>
+        <w:t xml:space="preserve"> </w:t>
+      </w:r>
+      <w:r>
+        <w:t xml:space="preserve">8,</w:t>
+      </w:r>
+      <w:r>
+        <w:t xml:space="preserve"> </w:t>
+      </w:r>
+      <w:r>
+        <w:rPr>
+          <w:rStyle w:val="VerbatimChar"/>
+        </w:rPr>
+        <w:t xml:space="preserve">md</w:t>
+      </w:r>
+      <w:r>
+        <w:t xml:space="preserve"> </w:t>
+      </w:r>
+      <w:r>
+        <w:t xml:space="preserve">12,</w:t>
+      </w:r>
+      <w:r>
+        <w:t xml:space="preserve"> </w:t>
+      </w:r>
+      <w:r>
+        <w:rPr>
+          <w:rStyle w:val="VerbatimChar"/>
+        </w:rPr>
+        <w:t xml:space="preserve">lg</w:t>
+      </w:r>
+      <w:r>
+        <w:t xml:space="preserve"> </w:t>
+      </w:r>
+      <w:r>
+        <w:t xml:space="preserve">20,</w:t>
+      </w:r>
+      <w:r>
+        <w:t xml:space="preserve"> </w:t>
+      </w:r>
+      <w:r>
+        <w:rPr>
+          <w:rStyle w:val="VerbatimChar"/>
+        </w:rPr>
+        <w:t xml:space="preserve">xl</w:t>
+      </w:r>
+      <w:r>
+        <w:t xml:space="preserve"> </w:t>
+      </w:r>
+      <w:r>
+        <w:t xml:space="preserve">28 px) y</w:t>
+      </w:r>
+      <w:r>
+        <w:t xml:space="preserve"> </w:t>
+      </w:r>
+      <w:r>
+        <w:t xml:space="preserve">controles de al menos 44–46 px de alto, cómodos para el pulgar.</w:t>
+      </w:r>
+    </w:p>
+    <w:p>
+      <w:pPr>
+        <w:numPr>
+          <w:ilvl w:val="0"/>
+          <w:numId w:val="1010"/>
+        </w:numPr>
+        <w:pStyle w:val="Compact"/>
+      </w:pPr>
+      <w:r>
+        <w:rPr>
+          <w:bCs/>
+          <w:b/>
+        </w:rPr>
+        <w:t xml:space="preserve">Movimiento discreto y con propósito:</w:t>
+      </w:r>
+      <w:r>
+        <w:t xml:space="preserve"> </w:t>
+      </w:r>
+      <w:r>
+        <w:t xml:space="preserve">botones y tarjetas suben 1–3 px</w:t>
+      </w:r>
+      <w:r>
+        <w:t xml:space="preserve"> </w:t>
+      </w:r>
+      <w:r>
+        <w:t xml:space="preserve">al pasar el cursor, el diálogo y los menús aparecen con un fundido</w:t>
+      </w:r>
+      <w:r>
+        <w:t xml:space="preserve"> </w:t>
+      </w:r>
+      <w:r>
+        <w:t xml:space="preserve">corto, el encabezado es de cristal esmerilado. La entrada de la portada</w:t>
+      </w:r>
+      <w:r>
+        <w:t xml:space="preserve"> </w:t>
+      </w:r>
+      <w:r>
+        <w:t xml:space="preserve">ya existente se conserva.</w:t>
+      </w:r>
+      <w:r>
+        <w:t xml:space="preserve"> </w:t>
+      </w:r>
+      <w:r>
+        <w:rPr>
+          <w:rStyle w:val="VerbatimChar"/>
+        </w:rPr>
+        <w:t xml:space="preserve">prefers-reduced-motion</w:t>
+      </w:r>
+      <w:r>
+        <w:t xml:space="preserve"> </w:t>
+      </w:r>
+      <w:r>
+        <w:t xml:space="preserve">lo apaga todo.</w:t>
+      </w:r>
+    </w:p>
+    <w:p>
+      <w:pPr>
+        <w:numPr>
+          <w:ilvl w:val="0"/>
+          <w:numId w:val="1010"/>
+        </w:numPr>
+        <w:pStyle w:val="Compact"/>
+      </w:pPr>
+      <w:r>
+        <w:rPr>
+          <w:bCs/>
+          <w:b/>
+        </w:rPr>
+        <w:t xml:space="preserve">Portada:</w:t>
+      </w:r>
+      <w:r>
+        <w:t xml:space="preserve"> </w:t>
+      </w:r>
+      <w:r>
+        <w:t xml:space="preserve">datos del consultorio en piezas de cristal, arco de la</w:t>
+      </w:r>
+      <w:r>
+        <w:t xml:space="preserve"> </w:t>
+      </w:r>
+      <w:r>
+        <w:t xml:space="preserve">foto con un contorno desplazado detrás y sombra flotante.</w:t>
+      </w:r>
+    </w:p>
+    <w:p>
+      <w:pPr>
+        <w:numPr>
+          <w:ilvl w:val="0"/>
+          <w:numId w:val="1010"/>
+        </w:numPr>
+        <w:pStyle w:val="Compact"/>
+      </w:pPr>
+      <w:r>
+        <w:rPr>
+          <w:bCs/>
+          <w:b/>
+        </w:rPr>
+        <w:t xml:space="preserve">Panel:</w:t>
+      </w:r>
+      <w:r>
+        <w:t xml:space="preserve"> </w:t>
+      </w:r>
+      <w:r>
+        <w:t xml:space="preserve">menú lateral con el elemento activo en degradado, datos de</w:t>
+      </w:r>
+      <w:r>
+        <w:t xml:space="preserve"> </w:t>
+      </w:r>
+      <w:r>
+        <w:t xml:space="preserve">Inicio con filete de color y distribución automática, listas dentro de</w:t>
+      </w:r>
+      <w:r>
+        <w:t xml:space="preserve"> </w:t>
+      </w:r>
+      <w:r>
+        <w:t xml:space="preserve">tarjetas con hover, estados con un punto de color además del texto.</w:t>
+      </w:r>
+    </w:p>
+    <w:p>
+      <w:pPr>
+        <w:numPr>
+          <w:ilvl w:val="0"/>
+          <w:numId w:val="1010"/>
+        </w:numPr>
+        <w:pStyle w:val="Compact"/>
+      </w:pPr>
+      <w:r>
+        <w:rPr>
+          <w:bCs/>
+          <w:b/>
+        </w:rPr>
+        <w:t xml:space="preserve">Accesibilidad:</w:t>
+      </w:r>
+      <w:r>
+        <w:t xml:space="preserve"> </w:t>
+      </w:r>
+      <w:r>
+        <w:t xml:space="preserve">se mantienen los contrastes medidos; el texto sobre</w:t>
+      </w:r>
+      <w:r>
+        <w:t xml:space="preserve"> </w:t>
+      </w:r>
+      <w:r>
+        <w:t xml:space="preserve">lavanda sigue en</w:t>
+      </w:r>
+      <w:r>
+        <w:t xml:space="preserve"> </w:t>
+      </w:r>
+      <w:r>
+        <w:rPr>
+          <w:rStyle w:val="VerbatimChar"/>
+        </w:rPr>
+        <w:t xml:space="preserve">--ink-900</w:t>
+      </w:r>
+      <w:r>
+        <w:t xml:space="preserve">; foco visible con halo (</w:t>
+      </w:r>
+      <w:r>
+        <w:rPr>
+          <w:rStyle w:val="VerbatimChar"/>
+        </w:rPr>
+        <w:t xml:space="preserve">--anillo-foco</w:t>
+      </w:r>
+      <w:r>
+        <w:t xml:space="preserve">);</w:t>
+      </w:r>
+      <w:r>
+        <w:t xml:space="preserve"> </w:t>
+      </w:r>
+      <w:r>
+        <w:t xml:space="preserve">las ayudas pasan de</w:t>
+      </w:r>
+      <w:r>
+        <w:t xml:space="preserve"> </w:t>
+      </w:r>
+      <w:r>
+        <w:rPr>
+          <w:rStyle w:val="VerbatimChar"/>
+        </w:rPr>
+        <w:t xml:space="preserve">--ink-400</w:t>
+      </w:r>
+      <w:r>
+        <w:t xml:space="preserve"> </w:t>
+      </w:r>
+      <w:r>
+        <w:t xml:space="preserve">a</w:t>
+      </w:r>
+      <w:r>
+        <w:t xml:space="preserve"> </w:t>
+      </w:r>
+      <w:r>
+        <w:rPr>
+          <w:rStyle w:val="VerbatimChar"/>
+        </w:rPr>
+        <w:t xml:space="preserve">--ink-600</w:t>
+      </w:r>
+      <w:r>
+        <w:t xml:space="preserve">.</w:t>
+      </w:r>
+    </w:p>
+    <w:p>
+      <w:pPr>
+        <w:numPr>
+          <w:ilvl w:val="0"/>
+          <w:numId w:val="1010"/>
+        </w:numPr>
+        <w:pStyle w:val="Compact"/>
+      </w:pPr>
+      <w:r>
+        <w:rPr>
+          <w:bCs/>
+          <w:b/>
+        </w:rPr>
+        <w:t xml:space="preserve">Regla vigente:</w:t>
+      </w:r>
+      <w:r>
+        <w:t xml:space="preserve"> </w:t>
+      </w:r>
+      <w:r>
+        <w:t xml:space="preserve">los colores (incluidos los de las sombras) viven solo</w:t>
+      </w:r>
+      <w:r>
+        <w:t xml:space="preserve"> </w:t>
+      </w:r>
+      <w:r>
+        <w:t xml:space="preserve">en</w:t>
+      </w:r>
+      <w:r>
+        <w:t xml:space="preserve"> </w:t>
+      </w:r>
+      <w:r>
+        <w:rPr>
+          <w:rStyle w:val="VerbatimChar"/>
+        </w:rPr>
+        <w:t xml:space="preserve">tokens.css</w:t>
+      </w:r>
+      <w:r>
+        <w:t xml:space="preserve">; el resto del CSS usa variables.</w:t>
+      </w:r>
+    </w:p>
     <w:bookmarkEnd w:id="51"/>
+    <w:bookmarkEnd w:id="52"/>
     <w:sectPr/>
   </w:body>
 </w:document>
@@ -5813,6 +6382,9 @@
     <w:abstractNumId w:val="991"/>
   </w:num>
   <w:num w:numId="1009">
+    <w:abstractNumId w:val="991"/>
+  </w:num>
+  <w:num w:numId="1010">
     <w:abstractNumId w:val="991"/>
   </w:num>
 </w:numbering>

</xml_diff>

<commit_message>
Frontend: identidad visual con el arco y especialidades en lavanda
Especialidades vuelven al lavanda sólido. El arco (corona del diente y
recorte de la foto de portada) pasa a ser el gesto principal: portal
lavanda detrás de la foto, panel de WhatsApp en arco morado, sello de
arco en los títulos de sección, íconos e iniciales en arco y franja
lavanda al inicio de cada sección del panel. Datos de Inicio en lavanda
y menú lateral en tarjeta. Solo CSS; documentado en la decisión 31.
</commit_message>
<xml_diff>
--- a/docs/para-drive/Decisiones técnicas.docx
+++ b/docs/para-drive/Decisiones técnicas.docx
@@ -6168,6 +6168,88 @@
       </w:r>
       <w:r>
         <w:t xml:space="preserve">; el resto del CSS usa variables.</w:t>
+      </w:r>
+    </w:p>
+    <w:p>
+      <w:pPr>
+        <w:pStyle w:val="FirstParagraph"/>
+      </w:pPr>
+      <w:r>
+        <w:rPr>
+          <w:bCs/>
+          <w:b/>
+        </w:rPr>
+        <w:t xml:space="preserve">Ajuste del mismo día (identidad con el arco).</w:t>
+      </w:r>
+      <w:r>
+        <w:t xml:space="preserve"> </w:t>
+      </w:r>
+      <w:r>
+        <w:t xml:space="preserve">Tras revisarlo, el equipo</w:t>
+      </w:r>
+      <w:r>
+        <w:t xml:space="preserve"> </w:t>
+      </w:r>
+      <w:r>
+        <w:t xml:space="preserve">prefirió las tarjetas de especialidades en lavanda y pidió secciones con más</w:t>
+      </w:r>
+      <w:r>
+        <w:t xml:space="preserve"> </w:t>
+      </w:r>
+      <w:r>
+        <w:t xml:space="preserve">carácter. Se volvió al lavanda sólido en Especialidades y se tomó el</w:t>
+      </w:r>
+      <w:r>
+        <w:t xml:space="preserve"> </w:t>
+      </w:r>
+      <w:r>
+        <w:rPr>
+          <w:bCs/>
+          <w:b/>
+        </w:rPr>
+        <w:t xml:space="preserve">arco</w:t>
+      </w:r>
+      <w:r>
+        <w:t xml:space="preserve"> </w:t>
+      </w:r>
+      <w:r>
+        <w:t xml:space="preserve">(la corona del diente y el recorte de la foto de portada) como único gesto</w:t>
+      </w:r>
+      <w:r>
+        <w:t xml:space="preserve"> </w:t>
+      </w:r>
+      <w:r>
+        <w:t xml:space="preserve">fuerte: un portal lavanda detrás de la foto de portada, el panel de WhatsApp</w:t>
+      </w:r>
+      <w:r>
+        <w:t xml:space="preserve"> </w:t>
+      </w:r>
+      <w:r>
+        <w:t xml:space="preserve">de Contacto con forma de arco en morado, un sello de arco junto a cada título</w:t>
+      </w:r>
+      <w:r>
+        <w:t xml:space="preserve"> </w:t>
+      </w:r>
+      <w:r>
+        <w:t xml:space="preserve">de sección (página pública y panel), arcos tenues en las esquinas de las</w:t>
+      </w:r>
+      <w:r>
+        <w:t xml:space="preserve"> </w:t>
+      </w:r>
+      <w:r>
+        <w:t xml:space="preserve">tarjetas, íconos e iniciales con forma de arco, y una franja lavanda al inicio</w:t>
+      </w:r>
+      <w:r>
+        <w:t xml:space="preserve"> </w:t>
+      </w:r>
+      <w:r>
+        <w:t xml:space="preserve">de cada sección del panel. Los datos de Inicio pasan a lavanda. Sigue siendo</w:t>
+      </w:r>
+      <w:r>
+        <w:t xml:space="preserve"> </w:t>
+      </w:r>
+      <w:r>
+        <w:t xml:space="preserve">solo CSS.</w:t>
       </w:r>
     </w:p>
     <w:bookmarkEnd w:id="51"/>

</xml_diff>

<commit_message>
Frontend: el diente del logo reemplaza los arcos decorativos
Textura de fondo, sello de los títulos de sección y marcas de agua de
especialidades, datos de Inicio y panel de WhatsApp usan ahora el diente
del logo del consultorio, definido como máscara en tokens.css
(--diente-logo, --diente-patron) para pintarlo en claro y oscuro.
Íconos e iniciales vuelven a formas redondeadas. Solo CSS.
</commit_message>
<xml_diff>
--- a/docs/para-drive/Decisiones técnicas.docx
+++ b/docs/para-drive/Decisiones técnicas.docx
@@ -6250,6 +6250,111 @@
       </w:r>
       <w:r>
         <w:t xml:space="preserve">solo CSS.</w:t>
+      </w:r>
+    </w:p>
+    <w:p>
+      <w:pPr>
+        <w:pStyle w:val="BodyText"/>
+      </w:pPr>
+      <w:r>
+        <w:rPr>
+          <w:bCs/>
+          <w:b/>
+        </w:rPr>
+        <w:t xml:space="preserve">Segundo ajuste (el diente del logo).</w:t>
+      </w:r>
+      <w:r>
+        <w:t xml:space="preserve"> </w:t>
+      </w:r>
+      <w:r>
+        <w:t xml:space="preserve">Los arcos decorativos se leían como</w:t>
+      </w:r>
+      <w:r>
+        <w:t xml:space="preserve"> </w:t>
+      </w:r>
+      <w:r>
+        <w:t xml:space="preserve">un recurso genérico. Se reemplazaron por el diente del logo del consultorio</w:t>
+      </w:r>
+      <w:r>
+        <w:t xml:space="preserve"> </w:t>
+      </w:r>
+      <w:r>
+        <w:t xml:space="preserve">(el mismo trazo de la textura del panel), definido una sola vez en</w:t>
+      </w:r>
+      <w:r>
+        <w:t xml:space="preserve"> </w:t>
+      </w:r>
+      <w:r>
+        <w:rPr>
+          <w:rStyle w:val="VerbatimChar"/>
+        </w:rPr>
+        <w:t xml:space="preserve">tokens.css</w:t>
+      </w:r>
+      <w:r>
+        <w:t xml:space="preserve"> </w:t>
+      </w:r>
+      <w:r>
+        <w:t xml:space="preserve">como máscara (</w:t>
+      </w:r>
+      <w:r>
+        <w:rPr>
+          <w:rStyle w:val="VerbatimChar"/>
+        </w:rPr>
+        <w:t xml:space="preserve">--diente-logo</w:t>
+      </w:r>
+      <w:r>
+        <w:t xml:space="preserve"> </w:t>
+      </w:r>
+      <w:r>
+        <w:t xml:space="preserve">y</w:t>
+      </w:r>
+      <w:r>
+        <w:t xml:space="preserve"> </w:t>
+      </w:r>
+      <w:r>
+        <w:rPr>
+          <w:rStyle w:val="VerbatimChar"/>
+        </w:rPr>
+        <w:t xml:space="preserve">--diente-patron</w:t>
+      </w:r>
+      <w:r>
+        <w:t xml:space="preserve">) para poder</w:t>
+      </w:r>
+      <w:r>
+        <w:t xml:space="preserve"> </w:t>
+      </w:r>
+      <w:r>
+        <w:t xml:space="preserve">pintarlo con cualquier color del sistema en claro y oscuro: textura de fondo</w:t>
+      </w:r>
+      <w:r>
+        <w:t xml:space="preserve"> </w:t>
+      </w:r>
+      <w:r>
+        <w:t xml:space="preserve">de «Nuestros espacios», sello junto a cada título de sección (página y</w:t>
+      </w:r>
+      <w:r>
+        <w:t xml:space="preserve"> </w:t>
+      </w:r>
+      <w:r>
+        <w:t xml:space="preserve">panel), marca de agua en las tarjetas de especialidades, en los datos de</w:t>
+      </w:r>
+      <w:r>
+        <w:t xml:space="preserve"> </w:t>
+      </w:r>
+      <w:r>
+        <w:t xml:space="preserve">Inicio y en el panel de WhatsApp. El arco se conserva solo donde repite el</w:t>
+      </w:r>
+      <w:r>
+        <w:t xml:space="preserve"> </w:t>
+      </w:r>
+      <w:r>
+        <w:t xml:space="preserve">recorte de la foto de portada (el portal de la portada y el panel de</w:t>
+      </w:r>
+      <w:r>
+        <w:t xml:space="preserve"> </w:t>
+      </w:r>
+      <w:r>
+        <w:t xml:space="preserve">WhatsApp).</w:t>
       </w:r>
     </w:p>
     <w:bookmarkEnd w:id="51"/>

</xml_diff>